<commit_message>
Redraw tech-network figure for legibility (layered layout, large labels, English)
Replaced the unreadable spring-layout figure with a clean layered layout:
process -> CPC -> core -> structure -> product (firms top band, offices bottom),
large bold node labels, category legend, and a metrics box (firm CII/SLI/PFS +
jurisdiction RRR) at the bottom. English labels to avoid missing-CJK-glyph tofu;
Korean explanation stays in the figure .md caption. Regenerated rev4 DOCX.

Co-Authored-By: Claude Opus 4.8 <noreply@anthropic.com>
Claude-Session: https://claude.ai/code/session_01SvckvZxt3hAXTDPnm8YPEC
</commit_message>
<xml_diff>
--- a/manuscript/draft_expanded_rev4.docx
+++ b/manuscript/draft_expanded_rev4.docx
@@ -4736,7 +4736,7 @@
       <w:r>
         <w:drawing>
           <wp:inline>
-            <wp:extent cx="5334000" cy="3323985"/>
+            <wp:extent cx="5334000" cy="3325380"/>
             <wp:effectExtent b="0" l="0" r="0" t="0"/>
             <wp:docPr descr="그림 4-1. 하이브리드 본딩 기술 네트워크(자료①②의 검증된 사실로 결정론적으로 구성; 기업 노드에 CII·SLI·PFS 지표 병기)" title="" id="48" name="Picture"/>
             <a:graphic>
@@ -4757,7 +4757,7 @@
                   <pic:spPr bwMode="auto">
                     <a:xfrm>
                       <a:off x="0" y="0"/>
-                      <a:ext cx="5334000" cy="3323985"/>
+                      <a:ext cx="5334000" cy="3325380"/>
                     </a:xfrm>
                     <a:prstGeom prst="rect">
                       <a:avLst/>

</xml_diff>

<commit_message>
rev4: use Korean tech-network figure; Chiplet/Dicing/Surface Prep in English
- tech_network_rich_ko.png: 칩렛->Chiplet, 다이싱->Dicing, 표면처리->Surface Prep
  (other Korean labels kept; 삼성전자 Korean; equipment makers English).
- rev4 figure reference switched to the Korean figure; DOCX regenerated with the
  Korean figure embedded.

Co-Authored-By: Claude Opus 4.8 <noreply@anthropic.com>
Claude-Session: https://claude.ai/code/session_01SvckvZxt3hAXTDPnm8YPEC
</commit_message>
<xml_diff>
--- a/manuscript/draft_expanded_rev4.docx
+++ b/manuscript/draft_expanded_rev4.docx
@@ -146,7 +146,7 @@
           <w:b/>
           <w:bCs/>
         </w:rPr>
-        <w:t xml:space="preserve">figures/tech_network_rich.png</w:t>
+        <w:t xml:space="preserve">figures/tech_network_rich_ko.png</w:t>
       </w:r>
       <w:r>
         <w:rPr>
@@ -4743,7 +4743,7 @@
               <a:graphicData uri="http://schemas.openxmlformats.org/drawingml/2006/picture">
                 <pic:pic>
                   <pic:nvPicPr>
-                    <pic:cNvPr descr="figures/tech_network_rich.png" id="49" name="Picture"/>
+                    <pic:cNvPr descr="figures/tech_network_rich_ko.png" id="49" name="Picture"/>
                     <pic:cNvPicPr>
                       <a:picLocks noChangeArrowheads="1" noChangeAspect="1"/>
                     </pic:cNvPicPr>

</xml_diff>